<commit_message>
chapter 4, figures index
</commit_message>
<xml_diff>
--- a/doc/report2026/20260423NZPR_power_mix_table.docx
+++ b/doc/report2026/20260423NZPR_power_mix_table.docx
@@ -1,6 +1,6 @@
 
 <file path=word/document.xml><?xml version="1.0" encoding="utf-8"?>
-<w:document xmlns:wpc="http://schemas.microsoft.com/office/word/2010/wordprocessingCanvas" xmlns:cx="http://schemas.microsoft.com/office/drawing/2014/chartex" xmlns:cx1="http://schemas.microsoft.com/office/drawing/2015/9/8/chartex" xmlns:cx2="http://schemas.microsoft.com/office/drawing/2015/10/21/chartex" xmlns:cx3="http://schemas.microsoft.com/office/drawing/2016/5/9/chartex" xmlns:cx4="http://schemas.microsoft.com/office/drawing/2016/5/10/chartex" xmlns:cx5="http://schemas.microsoft.com/office/drawing/2016/5/11/chartex" xmlns:cx6="http://schemas.microsoft.com/office/drawing/2016/5/12/chartex" xmlns:cx7="http://schemas.microsoft.com/office/drawing/2016/5/13/chartex" xmlns:cx8="http://schemas.microsoft.com/office/drawing/2016/5/14/chartex" xmlns:mc="http://schemas.openxmlformats.org/markup-compatibility/2006" xmlns:aink="http://schemas.microsoft.com/office/drawing/2016/ink" xmlns:am3d="http://schemas.microsoft.com/office/drawing/2017/model3d" xmlns:o="urn:schemas-microsoft-com:office:office" xmlns:oel="http://schemas.microsoft.com/office/2019/extlst" xmlns:r="http://schemas.openxmlformats.org/officeDocument/2006/relationships" xmlns:m="http://schemas.openxmlformats.org/officeDocument/2006/math" xmlns:v="urn:schemas-microsoft-com:vml" xmlns:wp14="http://schemas.microsoft.com/office/word/2010/wordprocessingDrawing" xmlns:wp="http://schemas.openxmlformats.org/drawingml/2006/wordprocessingDrawing" xmlns:w10="urn:schemas-microsoft-com:office:word" xmlns:w="http://schemas.openxmlformats.org/wordprocessingml/2006/main" xmlns:w14="http://schemas.microsoft.com/office/word/2010/wordml" xmlns:w15="http://schemas.microsoft.com/office/word/2012/wordml" xmlns:w16cex="http://schemas.microsoft.com/office/word/2018/wordml/cex" xmlns:w16cid="http://schemas.microsoft.com/office/word/2016/wordml/cid" xmlns:w16="http://schemas.microsoft.com/office/word/2018/wordml" xmlns:w16du="http://schemas.microsoft.com/office/word/2023/wordml/word16du" xmlns:w16sdtdh="http://schemas.microsoft.com/office/word/2020/wordml/sdtdatahash" xmlns:w16sdtfl="http://schemas.microsoft.com/office/word/2024/wordml/sdtformatlock" xmlns:w16se="http://schemas.microsoft.com/office/word/2015/wordml/symex" xmlns:wpg="http://schemas.microsoft.com/office/word/2010/wordprocessingGroup" xmlns:wpi="http://schemas.microsoft.com/office/word/2010/wordprocessingInk" xmlns:wne="http://schemas.microsoft.com/office/word/2006/wordml" xmlns:wps="http://schemas.microsoft.com/office/word/2010/wordprocessingShape" mc:Ignorable="w14 w15 w16se w16cid w16 w16cex w16sdtdh w16sdtfl w16du wp14">
+<w:document xmlns:wpc="http://schemas.microsoft.com/office/word/2010/wordprocessingCanvas" xmlns:cx="http://schemas.microsoft.com/office/drawing/2014/chartex" xmlns:cx1="http://schemas.microsoft.com/office/drawing/2015/9/8/chartex" xmlns:cx2="http://schemas.microsoft.com/office/drawing/2015/10/21/chartex" xmlns:cx3="http://schemas.microsoft.com/office/drawing/2016/5/9/chartex" xmlns:cx4="http://schemas.microsoft.com/office/drawing/2016/5/10/chartex" xmlns:cx5="http://schemas.microsoft.com/office/drawing/2016/5/11/chartex" xmlns:cx6="http://schemas.microsoft.com/office/drawing/2016/5/12/chartex" xmlns:cx7="http://schemas.microsoft.com/office/drawing/2016/5/13/chartex" xmlns:cx8="http://schemas.microsoft.com/office/drawing/2016/5/14/chartex" xmlns:mc="http://schemas.openxmlformats.org/markup-compatibility/2006" xmlns:m="http://schemas.openxmlformats.org/officeDocument/2006/math" xmlns:aink="http://schemas.microsoft.com/office/drawing/2016/ink" xmlns:am3d="http://schemas.microsoft.com/office/drawing/2017/model3d" xmlns:oel="http://schemas.microsoft.com/office/2019/extlst" xmlns:r="http://schemas.openxmlformats.org/officeDocument/2006/relationships" xmlns:wp14="http://schemas.microsoft.com/office/word/2010/wordprocessingDrawing" xmlns:wp="http://schemas.openxmlformats.org/drawingml/2006/wordprocessingDrawing" xmlns:wpg="http://schemas.microsoft.com/office/word/2010/wordprocessingGroup" xmlns:wpi="http://schemas.microsoft.com/office/word/2010/wordprocessingInk" xmlns:wps="http://schemas.microsoft.com/office/word/2010/wordprocessingShape" xmlns:o="urn:schemas-microsoft-com:office:office" xmlns:v="urn:schemas-microsoft-com:vml" xmlns:w10="urn:schemas-microsoft-com:office:word" xmlns:w="http://schemas.openxmlformats.org/wordprocessingml/2006/main" xmlns:w14="http://schemas.microsoft.com/office/word/2010/wordml" xmlns:w15="http://schemas.microsoft.com/office/word/2012/wordml" xmlns:w16cex="http://schemas.microsoft.com/office/word/2018/wordml/cex" xmlns:w16cid="http://schemas.microsoft.com/office/word/2016/wordml/cid" xmlns:w16="http://schemas.microsoft.com/office/word/2018/wordml" xmlns:w16sdtdh="http://schemas.microsoft.com/office/word/2020/wordml/sdtdatahash" xmlns:w16sdtfl="http://schemas.microsoft.com/office/word/2024/wordml/sdtformatlock" xmlns:w16se="http://schemas.microsoft.com/office/word/2015/wordml/symex" xmlns:w16du="http://schemas.microsoft.com/office/word/2023/wordml/word16du" xmlns:wne="http://schemas.microsoft.com/office/word/2006/wordml" mc:Ignorable="w14 w15 w16se w16cid w16 w16cex w16sdtdh w16sdtfl w16du wp14">
   <w:body>
     <w:p>
       <w:pPr>
@@ -2204,216 +2204,247 @@
         </w:numPr>
         <w:rPr>
           <w:rFonts w:ascii="Noto Sans JP" w:hAnsi="Noto Sans JP"/>
-          <w:szCs w:val="21"/>
+          <w:sz w:val="20"/>
+          <w:szCs w:val="20"/>
         </w:rPr>
       </w:pPr>
       <w:r>
         <w:rPr>
           <w:rFonts w:ascii="Noto Sans JP" w:hAnsi="Noto Sans JP"/>
-          <w:szCs w:val="21"/>
+          <w:sz w:val="20"/>
+          <w:szCs w:val="20"/>
         </w:rPr>
         <w:t xml:space="preserve">* </w:t>
       </w:r>
       <w:r>
         <w:rPr>
           <w:rFonts w:ascii="Noto Sans JP" w:hAnsi="Noto Sans JP" w:hint="eastAsia"/>
-          <w:szCs w:val="21"/>
+          <w:sz w:val="20"/>
+          <w:szCs w:val="20"/>
         </w:rPr>
         <w:t>エネ基の電源構成表では、陸上風力と洋上風力は区別され</w:t>
       </w:r>
       <w:r>
         <w:rPr>
           <w:rFonts w:ascii="Noto Sans JP" w:hAnsi="Noto Sans JP" w:hint="eastAsia"/>
-          <w:szCs w:val="21"/>
+          <w:sz w:val="20"/>
+          <w:szCs w:val="20"/>
         </w:rPr>
         <w:t>ず、風力発電の発電電力量が</w:t>
       </w:r>
       <w:r>
         <w:rPr>
           <w:rFonts w:ascii="Noto Sans JP" w:hAnsi="Noto Sans JP"/>
-          <w:szCs w:val="21"/>
+          <w:sz w:val="20"/>
+          <w:szCs w:val="20"/>
         </w:rPr>
         <w:t>51TWh/</w:t>
       </w:r>
       <w:r>
         <w:rPr>
           <w:rFonts w:ascii="Noto Sans JP" w:hAnsi="Noto Sans JP" w:hint="eastAsia"/>
-          <w:szCs w:val="21"/>
+          <w:sz w:val="20"/>
+          <w:szCs w:val="20"/>
         </w:rPr>
         <w:t>年となっている</w:t>
       </w:r>
       <w:r>
         <w:rPr>
           <w:rFonts w:ascii="Noto Sans JP" w:hAnsi="Noto Sans JP" w:hint="eastAsia"/>
-          <w:szCs w:val="21"/>
+          <w:sz w:val="20"/>
+          <w:szCs w:val="20"/>
         </w:rPr>
         <w:t>。ここでは、</w:t>
       </w:r>
       <w:r>
         <w:rPr>
           <w:rFonts w:ascii="Noto Sans JP" w:hAnsi="Noto Sans JP"/>
-          <w:szCs w:val="21"/>
+          <w:sz w:val="20"/>
+          <w:szCs w:val="20"/>
         </w:rPr>
         <w:t>2030</w:t>
       </w:r>
       <w:r>
         <w:rPr>
           <w:rFonts w:ascii="Noto Sans JP" w:hAnsi="Noto Sans JP" w:hint="eastAsia"/>
-          <w:szCs w:val="21"/>
+          <w:sz w:val="20"/>
+          <w:szCs w:val="20"/>
         </w:rPr>
         <w:t>年の陸上風力の設備容量を</w:t>
       </w:r>
       <w:r>
         <w:rPr>
           <w:rFonts w:ascii="Noto Sans JP" w:hAnsi="Noto Sans JP"/>
-          <w:szCs w:val="21"/>
+          <w:sz w:val="20"/>
+          <w:szCs w:val="20"/>
         </w:rPr>
         <w:t>17.9GW</w:t>
       </w:r>
       <w:r>
         <w:rPr>
           <w:rFonts w:ascii="Noto Sans JP" w:hAnsi="Noto Sans JP" w:hint="eastAsia"/>
-          <w:szCs w:val="21"/>
+          <w:sz w:val="20"/>
+          <w:szCs w:val="20"/>
         </w:rPr>
         <w:t>、洋上風力の設備容量を</w:t>
       </w:r>
       <w:r>
         <w:rPr>
           <w:rFonts w:ascii="Noto Sans JP" w:hAnsi="Noto Sans JP"/>
-          <w:szCs w:val="21"/>
+          <w:sz w:val="20"/>
+          <w:szCs w:val="20"/>
         </w:rPr>
         <w:t>5.7GW</w:t>
       </w:r>
       <w:r>
         <w:rPr>
           <w:rFonts w:ascii="Noto Sans JP" w:hAnsi="Noto Sans JP" w:hint="eastAsia"/>
-          <w:szCs w:val="21"/>
+          <w:sz w:val="20"/>
+          <w:szCs w:val="20"/>
         </w:rPr>
         <w:t>とし、</w:t>
       </w:r>
       <w:r>
         <w:rPr>
           <w:rFonts w:ascii="Noto Sans JP" w:hAnsi="Noto Sans JP"/>
-          <w:szCs w:val="21"/>
+          <w:sz w:val="20"/>
+          <w:szCs w:val="20"/>
         </w:rPr>
         <w:t>2021</w:t>
       </w:r>
       <w:r>
         <w:rPr>
           <w:rFonts w:ascii="Noto Sans JP" w:hAnsi="Noto Sans JP" w:hint="eastAsia"/>
-          <w:szCs w:val="21"/>
+          <w:sz w:val="20"/>
+          <w:szCs w:val="20"/>
         </w:rPr>
         <w:t>年</w:t>
       </w:r>
       <w:r>
         <w:rPr>
           <w:rFonts w:ascii="Noto Sans JP" w:hAnsi="Noto Sans JP"/>
-          <w:szCs w:val="21"/>
+          <w:sz w:val="20"/>
+          <w:szCs w:val="20"/>
         </w:rPr>
         <w:t>4</w:t>
       </w:r>
       <w:r>
         <w:rPr>
           <w:rFonts w:ascii="Noto Sans JP" w:hAnsi="Noto Sans JP" w:hint="eastAsia"/>
-          <w:szCs w:val="21"/>
+          <w:sz w:val="20"/>
+          <w:szCs w:val="20"/>
         </w:rPr>
         <w:t>月</w:t>
       </w:r>
       <w:r>
         <w:rPr>
           <w:rFonts w:ascii="Noto Sans JP" w:hAnsi="Noto Sans JP"/>
-          <w:szCs w:val="21"/>
+          <w:sz w:val="20"/>
+          <w:szCs w:val="20"/>
         </w:rPr>
         <w:t>7</w:t>
       </w:r>
       <w:r>
         <w:rPr>
           <w:rFonts w:ascii="Noto Sans JP" w:hAnsi="Noto Sans JP" w:hint="eastAsia"/>
-          <w:szCs w:val="21"/>
+          <w:sz w:val="20"/>
+          <w:szCs w:val="20"/>
         </w:rPr>
         <w:t>日の再エネ大量導入小委資料</w:t>
       </w:r>
       <w:r>
         <w:rPr>
           <w:rFonts w:ascii="Noto Sans JP" w:hAnsi="Noto Sans JP"/>
-          <w:szCs w:val="21"/>
+          <w:sz w:val="20"/>
+          <w:szCs w:val="20"/>
         </w:rPr>
         <w:t>2</w:t>
       </w:r>
       <w:r>
         <w:rPr>
           <w:rFonts w:ascii="Noto Sans JP" w:hAnsi="Noto Sans JP" w:hint="eastAsia"/>
-          <w:szCs w:val="21"/>
+          <w:sz w:val="20"/>
+          <w:szCs w:val="20"/>
         </w:rPr>
         <w:t>（</w:t>
       </w:r>
       <w:r>
         <w:rPr>
           <w:rFonts w:ascii="Noto Sans JP" w:hAnsi="Noto Sans JP"/>
-          <w:szCs w:val="21"/>
+          <w:sz w:val="20"/>
+          <w:szCs w:val="20"/>
         </w:rPr>
         <w:t>98</w:t>
       </w:r>
       <w:r>
         <w:rPr>
           <w:rFonts w:ascii="Noto Sans JP" w:hAnsi="Noto Sans JP" w:hint="eastAsia"/>
-          <w:szCs w:val="21"/>
+          <w:sz w:val="20"/>
+          <w:szCs w:val="20"/>
         </w:rPr>
         <w:t>ページ）に記載された陸上風力の設備利用率</w:t>
       </w:r>
       <w:r>
         <w:rPr>
           <w:rFonts w:ascii="Noto Sans JP" w:hAnsi="Noto Sans JP"/>
-          <w:szCs w:val="21"/>
+          <w:sz w:val="20"/>
+          <w:szCs w:val="20"/>
         </w:rPr>
         <w:t>21.7%</w:t>
       </w:r>
       <w:r>
         <w:rPr>
           <w:rFonts w:ascii="Noto Sans JP" w:hAnsi="Noto Sans JP" w:hint="eastAsia"/>
-          <w:szCs w:val="21"/>
+          <w:sz w:val="20"/>
+          <w:szCs w:val="20"/>
         </w:rPr>
         <w:t>、調達価格等算定委員会の</w:t>
       </w:r>
       <w:r>
         <w:rPr>
           <w:rFonts w:ascii="Noto Sans JP" w:hAnsi="Noto Sans JP"/>
-          <w:szCs w:val="21"/>
+          <w:sz w:val="20"/>
+          <w:szCs w:val="20"/>
         </w:rPr>
         <w:t>2020</w:t>
       </w:r>
       <w:r>
         <w:rPr>
           <w:rFonts w:ascii="Noto Sans JP" w:hAnsi="Noto Sans JP" w:hint="eastAsia"/>
-          <w:szCs w:val="21"/>
+          <w:sz w:val="20"/>
+          <w:szCs w:val="20"/>
         </w:rPr>
         <w:t>年度価格設定で想定された洋上風力の設備利用率</w:t>
       </w:r>
       <w:r>
         <w:rPr>
           <w:rFonts w:ascii="Noto Sans JP" w:hAnsi="Noto Sans JP"/>
-          <w:szCs w:val="21"/>
+          <w:sz w:val="20"/>
+          <w:szCs w:val="20"/>
         </w:rPr>
         <w:t>33.2%</w:t>
       </w:r>
       <w:r>
         <w:rPr>
           <w:rFonts w:ascii="Noto Sans JP" w:hAnsi="Noto Sans JP" w:hint="eastAsia"/>
-          <w:szCs w:val="21"/>
+          <w:sz w:val="20"/>
+          <w:szCs w:val="20"/>
         </w:rPr>
         <w:t>を用いて電力量を計算した（その場合、風力発電の発電量は</w:t>
       </w:r>
       <w:r>
         <w:rPr>
           <w:rFonts w:ascii="Noto Sans JP" w:hAnsi="Noto Sans JP"/>
-          <w:szCs w:val="21"/>
+          <w:sz w:val="20"/>
+          <w:szCs w:val="20"/>
         </w:rPr>
         <w:t>50.6TWh/</w:t>
       </w:r>
       <w:r>
         <w:rPr>
           <w:rFonts w:ascii="Noto Sans JP" w:hAnsi="Noto Sans JP" w:hint="eastAsia"/>
-          <w:szCs w:val="21"/>
+          <w:sz w:val="20"/>
+          <w:szCs w:val="20"/>
         </w:rPr>
         <w:t>年となる）。</w:t>
       </w:r>
@@ -2427,48 +2458,55 @@
         </w:numPr>
         <w:rPr>
           <w:rFonts w:ascii="Noto Sans JP" w:hAnsi="Noto Sans JP"/>
-          <w:szCs w:val="21"/>
+          <w:sz w:val="20"/>
+          <w:szCs w:val="20"/>
         </w:rPr>
       </w:pPr>
       <w:r>
         <w:rPr>
           <w:rFonts w:ascii="Noto Sans JP" w:hAnsi="Noto Sans JP"/>
-          <w:szCs w:val="21"/>
+          <w:sz w:val="20"/>
+          <w:szCs w:val="20"/>
         </w:rPr>
         <w:t xml:space="preserve">** </w:t>
       </w:r>
       <w:r>
         <w:rPr>
           <w:rFonts w:ascii="Noto Sans JP" w:hAnsi="Noto Sans JP" w:hint="eastAsia"/>
-          <w:szCs w:val="21"/>
+          <w:sz w:val="20"/>
+          <w:szCs w:val="20"/>
         </w:rPr>
         <w:t>第6次エネ基では水素・アンモニアを区別せず</w:t>
       </w:r>
       <w:r>
         <w:rPr>
           <w:rFonts w:ascii="Noto Sans JP" w:hAnsi="Noto Sans JP"/>
-          <w:szCs w:val="21"/>
+          <w:sz w:val="20"/>
+          <w:szCs w:val="20"/>
         </w:rPr>
         <w:t>0.9TWh/</w:t>
       </w:r>
       <w:r>
         <w:rPr>
           <w:rFonts w:ascii="Noto Sans JP" w:hAnsi="Noto Sans JP" w:hint="eastAsia"/>
-          <w:szCs w:val="21"/>
+          <w:sz w:val="20"/>
+          <w:szCs w:val="20"/>
         </w:rPr>
         <w:t>年、</w:t>
       </w:r>
       <w:r>
         <w:rPr>
           <w:rFonts w:ascii="Noto Sans JP" w:hAnsi="Noto Sans JP"/>
-          <w:szCs w:val="21"/>
+          <w:sz w:val="20"/>
+          <w:szCs w:val="20"/>
         </w:rPr>
         <w:t>1%</w:t>
       </w:r>
       <w:r>
         <w:rPr>
           <w:rFonts w:ascii="Noto Sans JP" w:hAnsi="Noto Sans JP" w:hint="eastAsia"/>
-          <w:szCs w:val="21"/>
+          <w:sz w:val="20"/>
+          <w:szCs w:val="20"/>
         </w:rPr>
         <w:t>としている。</w:t>
       </w:r>
@@ -5293,34 +5331,39 @@
         </w:numPr>
         <w:rPr>
           <w:rFonts w:ascii="Noto Sans JP" w:hAnsi="Noto Sans JP"/>
-          <w:szCs w:val="21"/>
+          <w:sz w:val="20"/>
+          <w:szCs w:val="20"/>
         </w:rPr>
       </w:pPr>
       <w:r>
         <w:rPr>
           <w:rFonts w:ascii="Noto Sans JP" w:hAnsi="Noto Sans JP"/>
-          <w:szCs w:val="21"/>
+          <w:sz w:val="20"/>
+          <w:szCs w:val="20"/>
         </w:rPr>
         <w:t xml:space="preserve">* </w:t>
       </w:r>
       <w:r>
         <w:rPr>
           <w:rFonts w:ascii="Noto Sans JP" w:hAnsi="Noto Sans JP" w:hint="eastAsia"/>
-          <w:szCs w:val="21"/>
+          <w:sz w:val="20"/>
+          <w:szCs w:val="20"/>
         </w:rPr>
         <w:t>エネ基のエネルギー需給見通しでは、陸上風力と洋上風力が区別されていない。ここでは、需給見通しの元になっている</w:t>
       </w:r>
       <w:r>
         <w:rPr>
           <w:rFonts w:ascii="Noto Sans JP" w:hAnsi="Noto Sans JP"/>
-          <w:szCs w:val="21"/>
+          <w:sz w:val="20"/>
+          <w:szCs w:val="20"/>
         </w:rPr>
         <w:t>RITE</w:t>
       </w:r>
       <w:r>
         <w:rPr>
           <w:rFonts w:ascii="Noto Sans JP" w:hAnsi="Noto Sans JP" w:hint="eastAsia"/>
-          <w:szCs w:val="21"/>
+          <w:sz w:val="20"/>
+          <w:szCs w:val="20"/>
         </w:rPr>
         <w:t>のシナリオにおける陸上風力と洋上風力の発電量に基づいて記載している。</w:t>
       </w:r>
@@ -5351,7 +5394,7 @@
 </file>
 
 <file path=word/endnotes.xml><?xml version="1.0" encoding="utf-8"?>
-<w:endnotes xmlns:wpc="http://schemas.microsoft.com/office/word/2010/wordprocessingCanvas" xmlns:cx="http://schemas.microsoft.com/office/drawing/2014/chartex" xmlns:cx1="http://schemas.microsoft.com/office/drawing/2015/9/8/chartex" xmlns:cx2="http://schemas.microsoft.com/office/drawing/2015/10/21/chartex" xmlns:cx3="http://schemas.microsoft.com/office/drawing/2016/5/9/chartex" xmlns:cx4="http://schemas.microsoft.com/office/drawing/2016/5/10/chartex" xmlns:cx5="http://schemas.microsoft.com/office/drawing/2016/5/11/chartex" xmlns:cx6="http://schemas.microsoft.com/office/drawing/2016/5/12/chartex" xmlns:cx7="http://schemas.microsoft.com/office/drawing/2016/5/13/chartex" xmlns:cx8="http://schemas.microsoft.com/office/drawing/2016/5/14/chartex" xmlns:mc="http://schemas.openxmlformats.org/markup-compatibility/2006" xmlns:aink="http://schemas.microsoft.com/office/drawing/2016/ink" xmlns:am3d="http://schemas.microsoft.com/office/drawing/2017/model3d" xmlns:o="urn:schemas-microsoft-com:office:office" xmlns:oel="http://schemas.microsoft.com/office/2019/extlst" xmlns:r="http://schemas.openxmlformats.org/officeDocument/2006/relationships" xmlns:m="http://schemas.openxmlformats.org/officeDocument/2006/math" xmlns:v="urn:schemas-microsoft-com:vml" xmlns:wp14="http://schemas.microsoft.com/office/word/2010/wordprocessingDrawing" xmlns:wp="http://schemas.openxmlformats.org/drawingml/2006/wordprocessingDrawing" xmlns:w10="urn:schemas-microsoft-com:office:word" xmlns:w="http://schemas.openxmlformats.org/wordprocessingml/2006/main" xmlns:w14="http://schemas.microsoft.com/office/word/2010/wordml" xmlns:w15="http://schemas.microsoft.com/office/word/2012/wordml" xmlns:w16cex="http://schemas.microsoft.com/office/word/2018/wordml/cex" xmlns:w16cid="http://schemas.microsoft.com/office/word/2016/wordml/cid" xmlns:w16="http://schemas.microsoft.com/office/word/2018/wordml" xmlns:w16du="http://schemas.microsoft.com/office/word/2023/wordml/word16du" xmlns:w16sdtdh="http://schemas.microsoft.com/office/word/2020/wordml/sdtdatahash" xmlns:w16sdtfl="http://schemas.microsoft.com/office/word/2024/wordml/sdtformatlock" xmlns:w16se="http://schemas.microsoft.com/office/word/2015/wordml/symex" xmlns:wpg="http://schemas.microsoft.com/office/word/2010/wordprocessingGroup" xmlns:wpi="http://schemas.microsoft.com/office/word/2010/wordprocessingInk" xmlns:wne="http://schemas.microsoft.com/office/word/2006/wordml" xmlns:wps="http://schemas.microsoft.com/office/word/2010/wordprocessingShape" mc:Ignorable="w14 w15 w16se w16cid w16 w16cex w16sdtdh w16sdtfl w16du wp14">
+<w:endnotes xmlns:wpc="http://schemas.microsoft.com/office/word/2010/wordprocessingCanvas" xmlns:cx="http://schemas.microsoft.com/office/drawing/2014/chartex" xmlns:cx1="http://schemas.microsoft.com/office/drawing/2015/9/8/chartex" xmlns:cx2="http://schemas.microsoft.com/office/drawing/2015/10/21/chartex" xmlns:cx3="http://schemas.microsoft.com/office/drawing/2016/5/9/chartex" xmlns:cx4="http://schemas.microsoft.com/office/drawing/2016/5/10/chartex" xmlns:cx5="http://schemas.microsoft.com/office/drawing/2016/5/11/chartex" xmlns:cx6="http://schemas.microsoft.com/office/drawing/2016/5/12/chartex" xmlns:cx7="http://schemas.microsoft.com/office/drawing/2016/5/13/chartex" xmlns:cx8="http://schemas.microsoft.com/office/drawing/2016/5/14/chartex" xmlns:mc="http://schemas.openxmlformats.org/markup-compatibility/2006" xmlns:m="http://schemas.openxmlformats.org/officeDocument/2006/math" xmlns:aink="http://schemas.microsoft.com/office/drawing/2016/ink" xmlns:am3d="http://schemas.microsoft.com/office/drawing/2017/model3d" xmlns:oel="http://schemas.microsoft.com/office/2019/extlst" xmlns:r="http://schemas.openxmlformats.org/officeDocument/2006/relationships" xmlns:wp14="http://schemas.microsoft.com/office/word/2010/wordprocessingDrawing" xmlns:wp="http://schemas.openxmlformats.org/drawingml/2006/wordprocessingDrawing" xmlns:wpg="http://schemas.microsoft.com/office/word/2010/wordprocessingGroup" xmlns:wpi="http://schemas.microsoft.com/office/word/2010/wordprocessingInk" xmlns:wps="http://schemas.microsoft.com/office/word/2010/wordprocessingShape" xmlns:o="urn:schemas-microsoft-com:office:office" xmlns:v="urn:schemas-microsoft-com:vml" xmlns:w10="urn:schemas-microsoft-com:office:word" xmlns:w="http://schemas.openxmlformats.org/wordprocessingml/2006/main" xmlns:w14="http://schemas.microsoft.com/office/word/2010/wordml" xmlns:w15="http://schemas.microsoft.com/office/word/2012/wordml" xmlns:w16cex="http://schemas.microsoft.com/office/word/2018/wordml/cex" xmlns:w16cid="http://schemas.microsoft.com/office/word/2016/wordml/cid" xmlns:w16="http://schemas.microsoft.com/office/word/2018/wordml" xmlns:w16sdtdh="http://schemas.microsoft.com/office/word/2020/wordml/sdtdatahash" xmlns:w16sdtfl="http://schemas.microsoft.com/office/word/2024/wordml/sdtformatlock" xmlns:w16se="http://schemas.microsoft.com/office/word/2015/wordml/symex" xmlns:w16du="http://schemas.microsoft.com/office/word/2023/wordml/word16du" xmlns:wne="http://schemas.microsoft.com/office/word/2006/wordml" mc:Ignorable="w14 w15 w16se w16cid w16 w16cex w16sdtdh w16sdtfl w16du wp14">
   <w:endnote w:type="separator" w:id="-1">
     <w:p>
       <w:pPr>
@@ -5376,7 +5419,7 @@
 </file>
 
 <file path=word/footnotes.xml><?xml version="1.0" encoding="utf-8"?>
-<w:footnotes xmlns:wpc="http://schemas.microsoft.com/office/word/2010/wordprocessingCanvas" xmlns:cx="http://schemas.microsoft.com/office/drawing/2014/chartex" xmlns:cx1="http://schemas.microsoft.com/office/drawing/2015/9/8/chartex" xmlns:cx2="http://schemas.microsoft.com/office/drawing/2015/10/21/chartex" xmlns:cx3="http://schemas.microsoft.com/office/drawing/2016/5/9/chartex" xmlns:cx4="http://schemas.microsoft.com/office/drawing/2016/5/10/chartex" xmlns:cx5="http://schemas.microsoft.com/office/drawing/2016/5/11/chartex" xmlns:cx6="http://schemas.microsoft.com/office/drawing/2016/5/12/chartex" xmlns:cx7="http://schemas.microsoft.com/office/drawing/2016/5/13/chartex" xmlns:cx8="http://schemas.microsoft.com/office/drawing/2016/5/14/chartex" xmlns:mc="http://schemas.openxmlformats.org/markup-compatibility/2006" xmlns:aink="http://schemas.microsoft.com/office/drawing/2016/ink" xmlns:am3d="http://schemas.microsoft.com/office/drawing/2017/model3d" xmlns:o="urn:schemas-microsoft-com:office:office" xmlns:oel="http://schemas.microsoft.com/office/2019/extlst" xmlns:r="http://schemas.openxmlformats.org/officeDocument/2006/relationships" xmlns:m="http://schemas.openxmlformats.org/officeDocument/2006/math" xmlns:v="urn:schemas-microsoft-com:vml" xmlns:wp14="http://schemas.microsoft.com/office/word/2010/wordprocessingDrawing" xmlns:wp="http://schemas.openxmlformats.org/drawingml/2006/wordprocessingDrawing" xmlns:w10="urn:schemas-microsoft-com:office:word" xmlns:w="http://schemas.openxmlformats.org/wordprocessingml/2006/main" xmlns:w14="http://schemas.microsoft.com/office/word/2010/wordml" xmlns:w15="http://schemas.microsoft.com/office/word/2012/wordml" xmlns:w16cex="http://schemas.microsoft.com/office/word/2018/wordml/cex" xmlns:w16cid="http://schemas.microsoft.com/office/word/2016/wordml/cid" xmlns:w16="http://schemas.microsoft.com/office/word/2018/wordml" xmlns:w16du="http://schemas.microsoft.com/office/word/2023/wordml/word16du" xmlns:w16sdtdh="http://schemas.microsoft.com/office/word/2020/wordml/sdtdatahash" xmlns:w16sdtfl="http://schemas.microsoft.com/office/word/2024/wordml/sdtformatlock" xmlns:w16se="http://schemas.microsoft.com/office/word/2015/wordml/symex" xmlns:wpg="http://schemas.microsoft.com/office/word/2010/wordprocessingGroup" xmlns:wpi="http://schemas.microsoft.com/office/word/2010/wordprocessingInk" xmlns:wne="http://schemas.microsoft.com/office/word/2006/wordml" xmlns:wps="http://schemas.microsoft.com/office/word/2010/wordprocessingShape" mc:Ignorable="w14 w15 w16se w16cid w16 w16cex w16sdtdh w16sdtfl w16du wp14">
+<w:footnotes xmlns:wpc="http://schemas.microsoft.com/office/word/2010/wordprocessingCanvas" xmlns:cx="http://schemas.microsoft.com/office/drawing/2014/chartex" xmlns:cx1="http://schemas.microsoft.com/office/drawing/2015/9/8/chartex" xmlns:cx2="http://schemas.microsoft.com/office/drawing/2015/10/21/chartex" xmlns:cx3="http://schemas.microsoft.com/office/drawing/2016/5/9/chartex" xmlns:cx4="http://schemas.microsoft.com/office/drawing/2016/5/10/chartex" xmlns:cx5="http://schemas.microsoft.com/office/drawing/2016/5/11/chartex" xmlns:cx6="http://schemas.microsoft.com/office/drawing/2016/5/12/chartex" xmlns:cx7="http://schemas.microsoft.com/office/drawing/2016/5/13/chartex" xmlns:cx8="http://schemas.microsoft.com/office/drawing/2016/5/14/chartex" xmlns:mc="http://schemas.openxmlformats.org/markup-compatibility/2006" xmlns:m="http://schemas.openxmlformats.org/officeDocument/2006/math" xmlns:aink="http://schemas.microsoft.com/office/drawing/2016/ink" xmlns:am3d="http://schemas.microsoft.com/office/drawing/2017/model3d" xmlns:oel="http://schemas.microsoft.com/office/2019/extlst" xmlns:r="http://schemas.openxmlformats.org/officeDocument/2006/relationships" xmlns:wp14="http://schemas.microsoft.com/office/word/2010/wordprocessingDrawing" xmlns:wp="http://schemas.openxmlformats.org/drawingml/2006/wordprocessingDrawing" xmlns:wpg="http://schemas.microsoft.com/office/word/2010/wordprocessingGroup" xmlns:wpi="http://schemas.microsoft.com/office/word/2010/wordprocessingInk" xmlns:wps="http://schemas.microsoft.com/office/word/2010/wordprocessingShape" xmlns:o="urn:schemas-microsoft-com:office:office" xmlns:v="urn:schemas-microsoft-com:vml" xmlns:w10="urn:schemas-microsoft-com:office:word" xmlns:w="http://schemas.openxmlformats.org/wordprocessingml/2006/main" xmlns:w14="http://schemas.microsoft.com/office/word/2010/wordml" xmlns:w15="http://schemas.microsoft.com/office/word/2012/wordml" xmlns:w16cex="http://schemas.microsoft.com/office/word/2018/wordml/cex" xmlns:w16cid="http://schemas.microsoft.com/office/word/2016/wordml/cid" xmlns:w16="http://schemas.microsoft.com/office/word/2018/wordml" xmlns:w16sdtdh="http://schemas.microsoft.com/office/word/2020/wordml/sdtdatahash" xmlns:w16sdtfl="http://schemas.microsoft.com/office/word/2024/wordml/sdtformatlock" xmlns:w16se="http://schemas.microsoft.com/office/word/2015/wordml/symex" xmlns:w16du="http://schemas.microsoft.com/office/word/2023/wordml/word16du" xmlns:wne="http://schemas.microsoft.com/office/word/2006/wordml" mc:Ignorable="w14 w15 w16se w16cid w16 w16cex w16sdtdh w16sdtfl w16du wp14">
   <w:footnote w:type="separator" w:id="-1">
     <w:p>
       <w:r>
@@ -5395,7 +5438,7 @@
 </file>
 
 <file path=word/numbering.xml><?xml version="1.0" encoding="utf-8"?>
-<w:numbering xmlns:wpc="http://schemas.microsoft.com/office/word/2010/wordprocessingCanvas" xmlns:cx="http://schemas.microsoft.com/office/drawing/2014/chartex" xmlns:cx1="http://schemas.microsoft.com/office/drawing/2015/9/8/chartex" xmlns:cx2="http://schemas.microsoft.com/office/drawing/2015/10/21/chartex" xmlns:cx3="http://schemas.microsoft.com/office/drawing/2016/5/9/chartex" xmlns:cx4="http://schemas.microsoft.com/office/drawing/2016/5/10/chartex" xmlns:cx5="http://schemas.microsoft.com/office/drawing/2016/5/11/chartex" xmlns:cx6="http://schemas.microsoft.com/office/drawing/2016/5/12/chartex" xmlns:cx7="http://schemas.microsoft.com/office/drawing/2016/5/13/chartex" xmlns:cx8="http://schemas.microsoft.com/office/drawing/2016/5/14/chartex" xmlns:mc="http://schemas.openxmlformats.org/markup-compatibility/2006" xmlns:aink="http://schemas.microsoft.com/office/drawing/2016/ink" xmlns:am3d="http://schemas.microsoft.com/office/drawing/2017/model3d" xmlns:o="urn:schemas-microsoft-com:office:office" xmlns:oel="http://schemas.microsoft.com/office/2019/extlst" xmlns:r="http://schemas.openxmlformats.org/officeDocument/2006/relationships" xmlns:m="http://schemas.openxmlformats.org/officeDocument/2006/math" xmlns:v="urn:schemas-microsoft-com:vml" xmlns:wp14="http://schemas.microsoft.com/office/word/2010/wordprocessingDrawing" xmlns:wp="http://schemas.openxmlformats.org/drawingml/2006/wordprocessingDrawing" xmlns:w10="urn:schemas-microsoft-com:office:word" xmlns:w="http://schemas.openxmlformats.org/wordprocessingml/2006/main" xmlns:w14="http://schemas.microsoft.com/office/word/2010/wordml" xmlns:w15="http://schemas.microsoft.com/office/word/2012/wordml" xmlns:w16cex="http://schemas.microsoft.com/office/word/2018/wordml/cex" xmlns:w16cid="http://schemas.microsoft.com/office/word/2016/wordml/cid" xmlns:w16="http://schemas.microsoft.com/office/word/2018/wordml" xmlns:w16du="http://schemas.microsoft.com/office/word/2023/wordml/word16du" xmlns:w16sdtdh="http://schemas.microsoft.com/office/word/2020/wordml/sdtdatahash" xmlns:w16sdtfl="http://schemas.microsoft.com/office/word/2024/wordml/sdtformatlock" xmlns:w16se="http://schemas.microsoft.com/office/word/2015/wordml/symex" xmlns:wpg="http://schemas.microsoft.com/office/word/2010/wordprocessingGroup" xmlns:wpi="http://schemas.microsoft.com/office/word/2010/wordprocessingInk" xmlns:wne="http://schemas.microsoft.com/office/word/2006/wordml" xmlns:wps="http://schemas.microsoft.com/office/word/2010/wordprocessingShape" mc:Ignorable="w14 w15 w16se w16cid w16 w16cex w16sdtdh w16sdtfl w16du wp14">
+<w:numbering xmlns:wpc="http://schemas.microsoft.com/office/word/2010/wordprocessingCanvas" xmlns:cx="http://schemas.microsoft.com/office/drawing/2014/chartex" xmlns:cx1="http://schemas.microsoft.com/office/drawing/2015/9/8/chartex" xmlns:cx2="http://schemas.microsoft.com/office/drawing/2015/10/21/chartex" xmlns:cx3="http://schemas.microsoft.com/office/drawing/2016/5/9/chartex" xmlns:cx4="http://schemas.microsoft.com/office/drawing/2016/5/10/chartex" xmlns:cx5="http://schemas.microsoft.com/office/drawing/2016/5/11/chartex" xmlns:cx6="http://schemas.microsoft.com/office/drawing/2016/5/12/chartex" xmlns:cx7="http://schemas.microsoft.com/office/drawing/2016/5/13/chartex" xmlns:cx8="http://schemas.microsoft.com/office/drawing/2016/5/14/chartex" xmlns:mc="http://schemas.openxmlformats.org/markup-compatibility/2006" xmlns:m="http://schemas.openxmlformats.org/officeDocument/2006/math" xmlns:aink="http://schemas.microsoft.com/office/drawing/2016/ink" xmlns:am3d="http://schemas.microsoft.com/office/drawing/2017/model3d" xmlns:oel="http://schemas.microsoft.com/office/2019/extlst" xmlns:r="http://schemas.openxmlformats.org/officeDocument/2006/relationships" xmlns:wp14="http://schemas.microsoft.com/office/word/2010/wordprocessingDrawing" xmlns:wp="http://schemas.openxmlformats.org/drawingml/2006/wordprocessingDrawing" xmlns:wpg="http://schemas.microsoft.com/office/word/2010/wordprocessingGroup" xmlns:wpi="http://schemas.microsoft.com/office/word/2010/wordprocessingInk" xmlns:wps="http://schemas.microsoft.com/office/word/2010/wordprocessingShape" xmlns:o="urn:schemas-microsoft-com:office:office" xmlns:v="urn:schemas-microsoft-com:vml" xmlns:w10="urn:schemas-microsoft-com:office:word" xmlns:w="http://schemas.openxmlformats.org/wordprocessingml/2006/main" xmlns:w14="http://schemas.microsoft.com/office/word/2010/wordml" xmlns:w15="http://schemas.microsoft.com/office/word/2012/wordml" xmlns:w16cex="http://schemas.microsoft.com/office/word/2018/wordml/cex" xmlns:w16cid="http://schemas.microsoft.com/office/word/2016/wordml/cid" xmlns:w16="http://schemas.microsoft.com/office/word/2018/wordml" xmlns:w16sdtdh="http://schemas.microsoft.com/office/word/2020/wordml/sdtdatahash" xmlns:w16sdtfl="http://schemas.microsoft.com/office/word/2024/wordml/sdtformatlock" xmlns:w16se="http://schemas.microsoft.com/office/word/2015/wordml/symex" xmlns:w16du="http://schemas.microsoft.com/office/word/2023/wordml/word16du" xmlns:wne="http://schemas.microsoft.com/office/word/2006/wordml" mc:Ignorable="w14 w15 w16se w16cid w16 w16cex w16sdtdh w16sdtfl w16du wp14">
   <w:abstractNum w:abstractNumId="0" w15:restartNumberingAfterBreak="0">
     <w:nsid w:val="FFFFFF7F"/>
     <w:multiLevelType w:val="singleLevel"/>
@@ -5698,7 +5741,7 @@
 </file>
 
 <file path=word/styles.xml><?xml version="1.0" encoding="utf-8"?>
-<w:styles xmlns:mc="http://schemas.openxmlformats.org/markup-compatibility/2006" xmlns:r="http://schemas.openxmlformats.org/officeDocument/2006/relationships" xmlns:w="http://schemas.openxmlformats.org/wordprocessingml/2006/main" xmlns:w14="http://schemas.microsoft.com/office/word/2010/wordml" xmlns:w15="http://schemas.microsoft.com/office/word/2012/wordml" xmlns:w16cex="http://schemas.microsoft.com/office/word/2018/wordml/cex" xmlns:w16cid="http://schemas.microsoft.com/office/word/2016/wordml/cid" xmlns:w16="http://schemas.microsoft.com/office/word/2018/wordml" xmlns:w16du="http://schemas.microsoft.com/office/word/2023/wordml/word16du" xmlns:w16sdtdh="http://schemas.microsoft.com/office/word/2020/wordml/sdtdatahash" xmlns:w16sdtfl="http://schemas.microsoft.com/office/word/2024/wordml/sdtformatlock" xmlns:w16se="http://schemas.microsoft.com/office/word/2015/wordml/symex" mc:Ignorable="w14 w15 w16se w16cid w16 w16cex w16sdtdh w16sdtfl w16du">
+<w:styles xmlns:mc="http://schemas.openxmlformats.org/markup-compatibility/2006" xmlns:r="http://schemas.openxmlformats.org/officeDocument/2006/relationships" xmlns:w="http://schemas.openxmlformats.org/wordprocessingml/2006/main" xmlns:w14="http://schemas.microsoft.com/office/word/2010/wordml" xmlns:w15="http://schemas.microsoft.com/office/word/2012/wordml" xmlns:w16cex="http://schemas.microsoft.com/office/word/2018/wordml/cex" xmlns:w16cid="http://schemas.microsoft.com/office/word/2016/wordml/cid" xmlns:w16="http://schemas.microsoft.com/office/word/2018/wordml" xmlns:w16sdtdh="http://schemas.microsoft.com/office/word/2020/wordml/sdtdatahash" xmlns:w16sdtfl="http://schemas.microsoft.com/office/word/2024/wordml/sdtformatlock" xmlns:w16se="http://schemas.microsoft.com/office/word/2015/wordml/symex" xmlns:w16du="http://schemas.microsoft.com/office/word/2023/wordml/word16du" mc:Ignorable="w14 w15 w16se w16cid w16 w16cex w16sdtdh w16sdtfl w16du">
   <w:docDefaults>
     <w:rPrDefault>
       <w:rPr>

</xml_diff>